<commit_message>
Added new files and code change
</commit_message>
<xml_diff>
--- a/12601472.docx
+++ b/12601472.docx
@@ -2403,7 +2403,7 @@
         </w:trPr>
         <w:tc>
           <w:tcPr>
-            <w:tcW w:w="675" w:type="dxa"/>
+            <w:tcW w:w="672" w:type="dxa"/>
             <w:shd w:val="clear" w:color="auto" w:fill="D9EAF7"/>
             <w:vAlign w:val="center"/>
           </w:tcPr>
@@ -2426,7 +2426,7 @@
         </w:tc>
         <w:tc>
           <w:tcPr>
-            <w:tcW w:w="5670" w:type="dxa"/>
+            <w:tcW w:w="5563" w:type="dxa"/>
             <w:shd w:val="clear" w:color="auto" w:fill="D9EAF7"/>
             <w:vAlign w:val="center"/>
           </w:tcPr>
@@ -2449,7 +2449,7 @@
         </w:tc>
         <w:tc>
           <w:tcPr>
-            <w:tcW w:w="4527" w:type="dxa"/>
+            <w:tcW w:w="4411" w:type="dxa"/>
             <w:shd w:val="clear" w:color="auto" w:fill="D9EAF7"/>
             <w:vAlign w:val="center"/>
           </w:tcPr>
@@ -2478,7 +2478,7 @@
         </w:trPr>
         <w:tc>
           <w:tcPr>
-            <w:tcW w:w="675" w:type="dxa"/>
+            <w:tcW w:w="672" w:type="dxa"/>
             <w:vAlign w:val="center"/>
           </w:tcPr>
           <w:p>
@@ -2499,7 +2499,7 @@
         </w:tc>
         <w:tc>
           <w:tcPr>
-            <w:tcW w:w="5670" w:type="dxa"/>
+            <w:tcW w:w="5563" w:type="dxa"/>
             <w:vAlign w:val="center"/>
           </w:tcPr>
           <w:p>
@@ -2520,7 +2520,7 @@
         </w:tc>
         <w:tc>
           <w:tcPr>
-            <w:tcW w:w="4527" w:type="dxa"/>
+            <w:tcW w:w="4411" w:type="dxa"/>
             <w:vAlign w:val="center"/>
           </w:tcPr>
           <w:p>
@@ -2589,7 +2589,7 @@
         </w:trPr>
         <w:tc>
           <w:tcPr>
-            <w:tcW w:w="675" w:type="dxa"/>
+            <w:tcW w:w="672" w:type="dxa"/>
             <w:vAlign w:val="center"/>
           </w:tcPr>
           <w:p>
@@ -2610,7 +2610,7 @@
         </w:tc>
         <w:tc>
           <w:tcPr>
-            <w:tcW w:w="5670" w:type="dxa"/>
+            <w:tcW w:w="5563" w:type="dxa"/>
             <w:vAlign w:val="center"/>
           </w:tcPr>
           <w:p>
@@ -2631,7 +2631,7 @@
         </w:tc>
         <w:tc>
           <w:tcPr>
-            <w:tcW w:w="4527" w:type="dxa"/>
+            <w:tcW w:w="4411" w:type="dxa"/>
             <w:vAlign w:val="center"/>
           </w:tcPr>
           <w:p>
@@ -2679,7 +2679,7 @@
         </w:trPr>
         <w:tc>
           <w:tcPr>
-            <w:tcW w:w="675" w:type="dxa"/>
+            <w:tcW w:w="672" w:type="dxa"/>
             <w:vAlign w:val="center"/>
           </w:tcPr>
           <w:p>
@@ -2700,7 +2700,7 @@
         </w:tc>
         <w:tc>
           <w:tcPr>
-            <w:tcW w:w="5670" w:type="dxa"/>
+            <w:tcW w:w="5563" w:type="dxa"/>
             <w:vAlign w:val="center"/>
           </w:tcPr>
           <w:p>
@@ -2721,7 +2721,7 @@
         </w:tc>
         <w:tc>
           <w:tcPr>
-            <w:tcW w:w="4527" w:type="dxa"/>
+            <w:tcW w:w="4411" w:type="dxa"/>
             <w:vAlign w:val="center"/>
           </w:tcPr>
           <w:p>
@@ -2769,7 +2769,7 @@
         </w:trPr>
         <w:tc>
           <w:tcPr>
-            <w:tcW w:w="675" w:type="dxa"/>
+            <w:tcW w:w="672" w:type="dxa"/>
             <w:vAlign w:val="center"/>
           </w:tcPr>
           <w:p>
@@ -2790,7 +2790,7 @@
         </w:tc>
         <w:tc>
           <w:tcPr>
-            <w:tcW w:w="5670" w:type="dxa"/>
+            <w:tcW w:w="5563" w:type="dxa"/>
             <w:vAlign w:val="center"/>
           </w:tcPr>
           <w:p>
@@ -2825,7 +2825,7 @@
         </w:tc>
         <w:tc>
           <w:tcPr>
-            <w:tcW w:w="4527" w:type="dxa"/>
+            <w:tcW w:w="4411" w:type="dxa"/>
             <w:vAlign w:val="center"/>
           </w:tcPr>
           <w:p>
@@ -2866,7 +2866,7 @@
         </w:trPr>
         <w:tc>
           <w:tcPr>
-            <w:tcW w:w="675" w:type="dxa"/>
+            <w:tcW w:w="672" w:type="dxa"/>
             <w:vAlign w:val="center"/>
           </w:tcPr>
           <w:p>
@@ -2887,7 +2887,7 @@
         </w:tc>
         <w:tc>
           <w:tcPr>
-            <w:tcW w:w="5670" w:type="dxa"/>
+            <w:tcW w:w="5563" w:type="dxa"/>
             <w:vAlign w:val="center"/>
           </w:tcPr>
           <w:p>
@@ -2908,7 +2908,7 @@
         </w:tc>
         <w:tc>
           <w:tcPr>
-            <w:tcW w:w="4527" w:type="dxa"/>
+            <w:tcW w:w="4411" w:type="dxa"/>
             <w:vAlign w:val="center"/>
           </w:tcPr>
           <w:p>
@@ -2938,96 +2938,6 @@
                 <w:szCs w:val="24"/>
               </w:rPr>
               <w:t>, a moderate negative relationship. Heavily scheduled class days were my least satisfying days.</w:t>
-            </w:r>
-          </w:p>
-        </w:tc>
-      </w:tr>
-      <w:tr>
-        <w:trPr>
-          <w:trHeight w:val="397"/>
-          <w:jc w:val="center"/>
-        </w:trPr>
-        <w:tc>
-          <w:tcPr>
-            <w:tcW w:w="675" w:type="dxa"/>
-            <w:vAlign w:val="center"/>
-          </w:tcPr>
-          <w:p>
-            <w:pPr>
-              <w:rPr>
-                <w:sz w:val="24"/>
-                <w:szCs w:val="24"/>
-              </w:rPr>
-            </w:pPr>
-            <w:r>
-              <w:rPr>
-                <w:sz w:val="24"/>
-                <w:szCs w:val="24"/>
-              </w:rPr>
-              <w:t>6</w:t>
-            </w:r>
-          </w:p>
-        </w:tc>
-        <w:tc>
-          <w:tcPr>
-            <w:tcW w:w="5670" w:type="dxa"/>
-            <w:vAlign w:val="center"/>
-          </w:tcPr>
-          <w:p>
-            <w:pPr>
-              <w:rPr>
-                <w:sz w:val="24"/>
-                <w:szCs w:val="24"/>
-              </w:rPr>
-            </w:pPr>
-            <w:r>
-              <w:rPr>
-                <w:sz w:val="24"/>
-                <w:szCs w:val="24"/>
-              </w:rPr>
-              <w:t>Free Time ↔ Feeling</w:t>
-            </w:r>
-          </w:p>
-        </w:tc>
-        <w:tc>
-          <w:tcPr>
-            <w:tcW w:w="4527" w:type="dxa"/>
-            <w:vAlign w:val="center"/>
-          </w:tcPr>
-          <w:p>
-            <w:pPr>
-              <w:rPr>
-                <w:sz w:val="24"/>
-                <w:szCs w:val="24"/>
-              </w:rPr>
-            </w:pPr>
-            <w:r>
-              <w:rPr>
-                <w:sz w:val="24"/>
-                <w:szCs w:val="24"/>
-              </w:rPr>
-              <w:t>r = 0.</w:t>
-            </w:r>
-            <w:r>
-              <w:rPr>
-                <w:sz w:val="24"/>
-                <w:szCs w:val="24"/>
-              </w:rPr>
-              <w:t>5</w:t>
-            </w:r>
-            <w:r>
-              <w:rPr>
-                <w:sz w:val="24"/>
-                <w:szCs w:val="24"/>
-              </w:rPr>
-              <w:t>1</w:t>
-            </w:r>
-            <w:r>
-              <w:rPr>
-                <w:sz w:val="24"/>
-                <w:szCs w:val="24"/>
-              </w:rPr>
-              <w:t>, a moderate positive relationship. Days with more free time were the days I felt best.</w:t>
             </w:r>
           </w:p>
         </w:tc>
@@ -3078,9 +2988,10 @@
     </w:p>
     <w:p>
       <w:pPr>
+        <w:jc w:val="both"/>
         <w:rPr>
           <w:sz w:val="24"/>
-          <w:szCs w:val="24"/>
+          <w:szCs w:val="32"/>
         </w:rPr>
       </w:pPr>
       <w:r>
@@ -3088,234 +2999,21 @@
           <w:sz w:val="24"/>
           <w:szCs w:val="24"/>
         </w:rPr>
-        <w:t>During this 39-day record period, I was able to maintain complete consistency</w:t>
+        <w:t>During these 40 days (13 August – 21 September 2026), I had no invalid records and recorded every day, giving my Data Continuity Index as 100%. My routine was mainly academic: my Academic Activity Index average was 326.15 minutes per day (made up of 257.38 minutes of classes and 68.78 minutes of self-study), and on top of that I spent 56.88 minutes a day on coding. Fitness was only 32.12 minutes and sleep was 365.75 minutes, or about six hours and six minutes. Overall</w:t>
       </w:r>
       <w:r>
         <w:rPr>
           <w:sz w:val="24"/>
           <w:szCs w:val="24"/>
         </w:rPr>
-        <w:t xml:space="preserve"> as I recorded all </w:t>
+        <w:t>,</w:t>
       </w:r>
       <w:r>
         <w:rPr>
           <w:sz w:val="24"/>
           <w:szCs w:val="24"/>
         </w:rPr>
-        <w:t>40</w:t>
-      </w:r>
-      <w:r>
-        <w:rPr>
-          <w:sz w:val="24"/>
-          <w:szCs w:val="24"/>
-        </w:rPr>
-        <w:t xml:space="preserve"> days from 13 august to 2</w:t>
-      </w:r>
-      <w:r>
-        <w:rPr>
-          <w:sz w:val="24"/>
-          <w:szCs w:val="24"/>
-        </w:rPr>
-        <w:t>1</w:t>
-      </w:r>
-      <w:r>
-        <w:rPr>
-          <w:sz w:val="24"/>
-          <w:szCs w:val="24"/>
-        </w:rPr>
-        <w:t xml:space="preserve"> September 2026 with no invalid entries. My routine </w:t>
-      </w:r>
-      <w:r>
-        <w:rPr>
-          <w:sz w:val="24"/>
-          <w:szCs w:val="24"/>
-        </w:rPr>
-        <w:t>w</w:t>
-      </w:r>
-      <w:r>
-        <w:rPr>
-          <w:sz w:val="24"/>
-          <w:szCs w:val="24"/>
-        </w:rPr>
-        <w:t xml:space="preserve">as mainly focused on academics: As my academic activity index was </w:t>
-      </w:r>
-      <w:r>
-        <w:rPr>
-          <w:sz w:val="24"/>
-          <w:szCs w:val="24"/>
-        </w:rPr>
-        <w:t xml:space="preserve">326.15 </w:t>
-      </w:r>
-      <w:r>
-        <w:rPr>
-          <w:sz w:val="24"/>
-          <w:szCs w:val="24"/>
-        </w:rPr>
-        <w:t>minutes per day including 256.28 minutes of classes and 69 minutes of self-study. I also spent 5</w:t>
-      </w:r>
-      <w:r>
-        <w:rPr>
-          <w:sz w:val="24"/>
-          <w:szCs w:val="24"/>
-        </w:rPr>
-        <w:t>6.88</w:t>
-      </w:r>
-      <w:r>
-        <w:rPr>
-          <w:sz w:val="24"/>
-          <w:szCs w:val="24"/>
-        </w:rPr>
-        <w:t xml:space="preserve"> minute per day on coding, Showing regular technical engagement alongside my coursework. My average </w:t>
-      </w:r>
-      <w:r>
-        <w:rPr>
-          <w:sz w:val="24"/>
-          <w:szCs w:val="24"/>
-        </w:rPr>
-        <w:t xml:space="preserve">time </w:t>
-      </w:r>
-      <w:r>
-        <w:rPr>
-          <w:sz w:val="24"/>
-          <w:szCs w:val="24"/>
-        </w:rPr>
-        <w:t>for fitness was 32.1</w:t>
-      </w:r>
-      <w:r>
-        <w:rPr>
-          <w:sz w:val="24"/>
-          <w:szCs w:val="24"/>
-        </w:rPr>
-        <w:t>2</w:t>
-      </w:r>
-      <w:r>
-        <w:rPr>
-          <w:sz w:val="24"/>
-          <w:szCs w:val="24"/>
-        </w:rPr>
-        <w:t xml:space="preserve"> minutes while my average for sleep was 36</w:t>
-      </w:r>
-      <w:r>
-        <w:rPr>
-          <w:sz w:val="24"/>
-          <w:szCs w:val="24"/>
-        </w:rPr>
-        <w:t>5.75</w:t>
-      </w:r>
-      <w:r>
-        <w:rPr>
-          <w:sz w:val="24"/>
-          <w:szCs w:val="24"/>
-        </w:rPr>
-        <w:t xml:space="preserve"> minutes. High track </w:t>
-      </w:r>
-      <w:r>
-        <w:rPr>
-          <w:sz w:val="24"/>
-          <w:szCs w:val="24"/>
-        </w:rPr>
-        <w:t>900.62</w:t>
-      </w:r>
-      <w:r>
-        <w:rPr>
-          <w:sz w:val="24"/>
-          <w:szCs w:val="24"/>
-        </w:rPr>
-        <w:t xml:space="preserve"> minutes per day in total and still had around </w:t>
-      </w:r>
-      <w:r>
-        <w:rPr>
-          <w:sz w:val="24"/>
-          <w:szCs w:val="24"/>
-        </w:rPr>
-        <w:t>539.38</w:t>
-      </w:r>
-      <w:r>
-        <w:rPr>
-          <w:sz w:val="24"/>
-          <w:szCs w:val="24"/>
-        </w:rPr>
-        <w:t xml:space="preserve"> minutes of my free time.</w:t>
-      </w:r>
-      <w:r>
-        <w:rPr>
-          <w:rFonts w:ascii="Segoe UI" w:hAnsi="Segoe UI" w:cs="Segoe UI"/>
-          <w:color w:val="1A1A1A"/>
-          <w:sz w:val="23"/>
-          <w:szCs w:val="23"/>
-          <w:shd w:val="clear" w:color="auto" w:fill="FFFFFF"/>
-        </w:rPr>
-        <w:t xml:space="preserve"> </w:t>
-      </w:r>
-      <w:r>
-        <w:rPr>
-          <w:sz w:val="24"/>
-          <w:szCs w:val="24"/>
-        </w:rPr>
-        <w:t>The three required relationships were all weak, but the extra relationships I tested were much clearer. Total Tracked Time and Energy gave r = -0.</w:t>
-      </w:r>
-      <w:r>
-        <w:rPr>
-          <w:sz w:val="24"/>
-          <w:szCs w:val="24"/>
-        </w:rPr>
-        <w:t>59</w:t>
-      </w:r>
-      <w:r>
-        <w:rPr>
-          <w:sz w:val="24"/>
-          <w:szCs w:val="24"/>
-        </w:rPr>
-        <w:t>, Class Time and Satisfaction gave r = -0.4</w:t>
-      </w:r>
-      <w:r>
-        <w:rPr>
-          <w:sz w:val="24"/>
-          <w:szCs w:val="24"/>
-        </w:rPr>
-        <w:t>7</w:t>
-      </w:r>
-      <w:r>
-        <w:rPr>
-          <w:sz w:val="24"/>
-          <w:szCs w:val="24"/>
-        </w:rPr>
-        <w:t>, and Free Time and Feeling gave r = 0.</w:t>
-      </w:r>
-      <w:r>
-        <w:rPr>
-          <w:sz w:val="24"/>
-          <w:szCs w:val="24"/>
-        </w:rPr>
-        <w:t>5</w:t>
-      </w:r>
-      <w:r>
-        <w:rPr>
-          <w:sz w:val="24"/>
-          <w:szCs w:val="24"/>
-        </w:rPr>
-        <w:t>1</w:t>
-      </w:r>
-      <w:r>
-        <w:rPr>
-          <w:sz w:val="24"/>
-          <w:szCs w:val="24"/>
-        </w:rPr>
-        <w:t>. Together these show that my experience was driven by my total daily workload rather than by any single activity. The longer and more heavily scheduled my day was, the lower my energy and satisfaction, while days with more free time felt noticeably better. My Experience Index of 2.8</w:t>
-      </w:r>
-      <w:r>
-        <w:rPr>
-          <w:sz w:val="24"/>
-          <w:szCs w:val="24"/>
-        </w:rPr>
-        <w:t>7</w:t>
-      </w:r>
-      <w:r>
-        <w:rPr>
-          <w:sz w:val="24"/>
-          <w:szCs w:val="24"/>
-        </w:rPr>
-        <w:t xml:space="preserve"> out of 5 reflects this moderate overall experience.</w:t>
+        <w:t xml:space="preserve"> I tracked 900.62 minutes of each day and left 539.38 minutes untracked (that is 37%, the biggest weakness). All three of the required relationships were actually weak: Sleep and Energy r = −0.25, Study and Satisfaction r = −0.18 and Coding and Energy r = 0.04. With 40 days a correlation needs to reach about 0.31 to mean much, and none of these did. The two I chose myself were stronger: Total Tracked Time and Energy r = −0.59 and Class Time and Satisfaction r = −0.47 – so how I felt depended more on how busy my day was than on any one activity in it.</w:t>
       </w:r>
     </w:p>
     <w:p>
@@ -3348,6 +3046,7 @@
         <w:rPr>
           <w:sz w:val="24"/>
           <w:szCs w:val="32"/>
+          <w:lang w:val="en-IN"/>
         </w:rPr>
       </w:pPr>
       <w:r>
@@ -3355,184 +3054,7 @@
           <w:sz w:val="24"/>
           <w:szCs w:val="32"/>
         </w:rPr>
-        <w:t xml:space="preserve">I want to improve my routine of sleep, physical activity and my focused work. </w:t>
-      </w:r>
-      <w:r>
-        <w:rPr>
-          <w:sz w:val="24"/>
-          <w:szCs w:val="32"/>
-        </w:rPr>
-        <w:t xml:space="preserve">My sleep averaged </w:t>
-      </w:r>
-      <w:r>
-        <w:rPr>
-          <w:sz w:val="24"/>
-          <w:szCs w:val="32"/>
-        </w:rPr>
-        <w:t>365.75</w:t>
-      </w:r>
-      <w:r>
-        <w:rPr>
-          <w:sz w:val="24"/>
-          <w:szCs w:val="32"/>
-        </w:rPr>
-        <w:t xml:space="preserve"> </w:t>
-      </w:r>
-      <w:r>
-        <w:rPr>
-          <w:sz w:val="24"/>
-          <w:szCs w:val="32"/>
-        </w:rPr>
-        <w:t>minutes, which is about six hours and four minutes per day, so I will fix a regular bedtime and wake-up time and move gradually towards at least seven hours.</w:t>
-      </w:r>
-      <w:r>
-        <w:rPr>
-          <w:sz w:val="24"/>
-          <w:szCs w:val="32"/>
-        </w:rPr>
-        <w:t xml:space="preserve"> </w:t>
-      </w:r>
-      <w:r>
-        <w:rPr>
-          <w:sz w:val="24"/>
-          <w:szCs w:val="32"/>
-        </w:rPr>
-        <w:t>My fitness average was 32.1</w:t>
-      </w:r>
-      <w:r>
-        <w:rPr>
-          <w:sz w:val="24"/>
-          <w:szCs w:val="32"/>
-        </w:rPr>
-        <w:t>2</w:t>
-      </w:r>
-      <w:r>
-        <w:rPr>
-          <w:sz w:val="24"/>
-          <w:szCs w:val="32"/>
-        </w:rPr>
-        <w:t xml:space="preserve"> minutes, so I will schedule at least 30 minutes of exercise on five days every week instead of leaving it to chance</w:t>
-      </w:r>
-      <w:r>
-        <w:rPr>
-          <w:sz w:val="24"/>
-          <w:szCs w:val="32"/>
-        </w:rPr>
-        <w:t xml:space="preserve">. </w:t>
-      </w:r>
-      <w:r>
-        <w:rPr>
-          <w:sz w:val="24"/>
-          <w:szCs w:val="32"/>
-        </w:rPr>
-        <w:t>The strongest evidence in my data is the negative relationship between Total Tracked Time and Energy (r = -0.</w:t>
-      </w:r>
-      <w:r>
-        <w:rPr>
-          <w:sz w:val="24"/>
-          <w:szCs w:val="32"/>
-        </w:rPr>
-        <w:t>59</w:t>
-      </w:r>
-      <w:r>
-        <w:rPr>
-          <w:sz w:val="24"/>
-          <w:szCs w:val="32"/>
-        </w:rPr>
-        <w:t xml:space="preserve">), so simply adding more hours is not the answer. </w:t>
-      </w:r>
-      <w:proofErr w:type="gramStart"/>
-      <w:r>
-        <w:rPr>
-          <w:sz w:val="24"/>
-          <w:szCs w:val="32"/>
-        </w:rPr>
-        <w:t>Instead</w:t>
-      </w:r>
-      <w:proofErr w:type="gramEnd"/>
-      <w:r>
-        <w:rPr>
-          <w:sz w:val="24"/>
-          <w:szCs w:val="32"/>
-        </w:rPr>
-        <w:t xml:space="preserve"> I will cap my heaviest days, divide my </w:t>
-      </w:r>
-      <w:r>
-        <w:rPr>
-          <w:sz w:val="24"/>
-          <w:szCs w:val="24"/>
-        </w:rPr>
-        <w:t xml:space="preserve">326.15 </w:t>
-      </w:r>
-      <w:r>
-        <w:rPr>
-          <w:sz w:val="24"/>
-          <w:szCs w:val="32"/>
-        </w:rPr>
-        <w:t>minutes of academic work into shorter planned sessions with proper breaks, and protect recovery time when classes are long</w:t>
-      </w:r>
-      <w:r>
-        <w:rPr>
-          <w:sz w:val="24"/>
-          <w:szCs w:val="32"/>
-        </w:rPr>
-        <w:t xml:space="preserve">. </w:t>
-      </w:r>
-      <w:r>
-        <w:rPr>
-          <w:sz w:val="24"/>
-          <w:szCs w:val="32"/>
-        </w:rPr>
-        <w:t>I also want to improve my coding practice from 5</w:t>
-      </w:r>
-      <w:r>
-        <w:rPr>
-          <w:sz w:val="24"/>
-          <w:szCs w:val="32"/>
-        </w:rPr>
-        <w:t>6.88</w:t>
-      </w:r>
-      <w:r>
-        <w:rPr>
-          <w:sz w:val="24"/>
-          <w:szCs w:val="32"/>
-        </w:rPr>
-        <w:t xml:space="preserve"> minutes to focused </w:t>
-      </w:r>
-      <w:r>
-        <w:rPr>
-          <w:sz w:val="24"/>
-          <w:szCs w:val="32"/>
-        </w:rPr>
-        <w:t>o</w:t>
-      </w:r>
-      <w:r>
-        <w:rPr>
-          <w:sz w:val="24"/>
-          <w:szCs w:val="32"/>
-        </w:rPr>
-        <w:t>ne hour on most of the days. Then finally I want to use part of my 5</w:t>
-      </w:r>
-      <w:r>
-        <w:rPr>
-          <w:sz w:val="24"/>
-          <w:szCs w:val="32"/>
-        </w:rPr>
-        <w:t>39.38</w:t>
-      </w:r>
-      <w:r>
-        <w:rPr>
-          <w:sz w:val="24"/>
-          <w:szCs w:val="32"/>
-        </w:rPr>
-        <w:t xml:space="preserve"> minutes of free time for rest, hobbies and planning so that my routine remains balanced</w:t>
-      </w:r>
-      <w:r>
-        <w:rPr>
-          <w:sz w:val="24"/>
-          <w:szCs w:val="32"/>
-        </w:rPr>
-        <w:t>.</w:t>
+        <w:t>My intent is to improve the quality of my sleep, my fitness, my coding, and my tracking. My sleep is at 365.75 minutes, or just about six hours and six minutes, so I'll set a regular bedtime and wake-up time and seek to work my way up to seven hours. My fitness is at 32.12 minutes, so I'll plan a minimum of thirty minutes five days a week rather than wing it. My strongest result is Total Tracked Time versus Energy (r = −0.59), so more hours isn't the fix. Class Time versus Satisfaction (r = −0.47) tells me my busiest class days are my least satisfying days, so I'll limit how busy I allow days to be, subdivide the 326.15 minutes of academic work into smaller chunks interspersed with breaks, and provide a buffer for long classes. I also want to bring my coding up to a dedicated hour per day instead of 56.88 minutes. Lastly, 539.38 minutes is a chunk of my day that I'm not tracking, so I'll log that time and spend some of it resting and planning.</w:t>
       </w:r>
     </w:p>
     <w:p>
@@ -4729,7 +4251,6 @@
   <w:style w:type="character" w:default="1" w:styleId="DefaultParagraphFont">
     <w:name w:val="Default Paragraph Font"/>
     <w:uiPriority w:val="1"/>
-    <w:semiHidden/>
     <w:unhideWhenUsed/>
   </w:style>
   <w:style w:type="table" w:default="1" w:styleId="TableNormal">

</xml_diff>